<commit_message>
feat: updated proposal skill to handle retainer phases and rounding to days/weeks estimates
</commit_message>
<xml_diff>
--- a/platforms/claude/.claude/skills/generate-proposal/assets/template-example.docx
+++ b/platforms/claude/.claude/skills/generate-proposal/assets/template-example.docx
@@ -1386,23 +1386,7 @@
         <w:sz w:val="18"/>
         <w:szCs w:val="18"/>
       </w:rPr>
-      <w:t>{{Project Name}}</w:t>
-    </w:r>
-    <w:r>
-      <w:rPr>
-        <w:color w:val="808080"/>
-        <w:sz w:val="18"/>
-        <w:szCs w:val="18"/>
-      </w:rPr>
-      <w:t xml:space="preserve">  |  </w:t>
-    </w:r>
-    <w:r>
-      <w:rPr>
-        <w:color w:val="808080"/>
-        <w:sz w:val="18"/>
-        <w:szCs w:val="18"/>
-      </w:rPr>
-      <w:t xml:space="preserve">{{feature or sub project name}} </w:t>
+      <w:t xml:space="preserve">{{Project Name}}  |  {{feature or sub project name}} </w:t>
     </w:r>
     <w:r>
       <w:rPr>
@@ -2557,6 +2541,21 @@
 </file>
 
 <file path=customXml/item1.xml><?xml version="1.0" encoding="utf-8"?>
+<?mso-contentType ?>
+<FormTemplates xmlns="http://schemas.microsoft.com/sharepoint/v3/contenttype/forms">
+  <Display>DocumentLibraryForm</Display>
+  <Edit>DocumentLibraryForm</Edit>
+  <New>DocumentLibraryForm</New>
+</FormTemplates>
+</file>
+
+<file path=customXml/item2.xml><?xml version="1.0" encoding="utf-8"?>
+<p:properties xmlns:p="http://schemas.microsoft.com/office/2006/metadata/properties" xmlns:xsi="http://www.w3.org/2001/XMLSchema-instance" xmlns:pc="http://schemas.microsoft.com/office/infopath/2007/PartnerControls">
+  <documentManagement/>
+</p:properties>
+</file>
+
+<file path=customXml/item3.xml><?xml version="1.0" encoding="utf-8"?>
 <ct:contentTypeSchema xmlns:ct="http://schemas.microsoft.com/office/2006/metadata/contentType" xmlns:ma="http://schemas.microsoft.com/office/2006/metadata/properties/metaAttributes" ct:_="" ma:_="" ma:contentTypeName="Document" ma:contentTypeID="0x010100A72B057A40780745B4381C7F96345676" ma:contentTypeVersion="4" ma:contentTypeDescription="Create a new document." ma:contentTypeScope="" ma:versionID="5b047e2644f65897fa5ebff40ce5df91">
   <xsd:schema xmlns:xsd="http://www.w3.org/2001/XMLSchema" xmlns:xs="http://www.w3.org/2001/XMLSchema" xmlns:p="http://schemas.microsoft.com/office/2006/metadata/properties" xmlns:ns2="da561cce-79d4-41ae-b0ed-ffff044ab7c0" targetNamespace="http://schemas.microsoft.com/office/2006/metadata/properties" ma:root="true" ma:fieldsID="d77e5effbfe5336c478b2569dcd45617" ns2:_="">
     <xsd:import namespace="da561cce-79d4-41ae-b0ed-ffff044ab7c0"/>
@@ -2700,22 +2699,24 @@
 </ct:contentTypeSchema>
 </file>
 
-<file path=customXml/item2.xml><?xml version="1.0" encoding="utf-8"?>
-<p:properties xmlns:p="http://schemas.microsoft.com/office/2006/metadata/properties" xmlns:xsi="http://www.w3.org/2001/XMLSchema-instance" xmlns:pc="http://schemas.microsoft.com/office/infopath/2007/PartnerControls">
-  <documentManagement/>
-</p:properties>
+<file path=customXml/itemProps1.xml><?xml version="1.0" encoding="utf-8"?>
+<ds:datastoreItem xmlns:ds="http://schemas.openxmlformats.org/officeDocument/2006/customXml" ds:itemID="{AE688F25-FFA3-4BC9-9A13-31455E2654D4}">
+  <ds:schemaRefs>
+    <ds:schemaRef ds:uri="http://schemas.microsoft.com/sharepoint/v3/contenttype/forms"/>
+  </ds:schemaRefs>
+</ds:datastoreItem>
 </file>
 
-<file path=customXml/item3.xml><?xml version="1.0" encoding="utf-8"?>
-<?mso-contentType ?>
-<FormTemplates xmlns="http://schemas.microsoft.com/sharepoint/v3/contenttype/forms">
-  <Display>DocumentLibraryForm</Display>
-  <Edit>DocumentLibraryForm</Edit>
-  <New>DocumentLibraryForm</New>
-</FormTemplates>
+<file path=customXml/itemProps2.xml><?xml version="1.0" encoding="utf-8"?>
+<ds:datastoreItem xmlns:ds="http://schemas.openxmlformats.org/officeDocument/2006/customXml" ds:itemID="{F43DCF0A-E35B-4993-8E5C-11FAD95E3107}">
+  <ds:schemaRefs>
+    <ds:schemaRef ds:uri="http://schemas.microsoft.com/office/2006/metadata/properties"/>
+    <ds:schemaRef ds:uri="http://schemas.microsoft.com/office/infopath/2007/PartnerControls"/>
+  </ds:schemaRefs>
+</ds:datastoreItem>
 </file>
 
-<file path=customXml/itemProps1.xml><?xml version="1.0" encoding="utf-8"?>
+<file path=customXml/itemProps3.xml><?xml version="1.0" encoding="utf-8"?>
 <ds:datastoreItem xmlns:ds="http://schemas.openxmlformats.org/officeDocument/2006/customXml" ds:itemID="{FF351236-6058-469E-8603-2C20269AFAF8}">
   <ds:schemaRefs>
     <ds:schemaRef ds:uri="http://schemas.microsoft.com/office/2006/metadata/contentType"/>
@@ -2731,21 +2732,4 @@
     <ds:schemaRef ds:uri="http://schemas.microsoft.com/internal/obd"/>
   </ds:schemaRefs>
 </ds:datastoreItem>
-</file>
-
-<file path=customXml/itemProps2.xml><?xml version="1.0" encoding="utf-8"?>
-<ds:datastoreItem xmlns:ds="http://schemas.openxmlformats.org/officeDocument/2006/customXml" ds:itemID="{F43DCF0A-E35B-4993-8E5C-11FAD95E3107}">
-  <ds:schemaRefs>
-    <ds:schemaRef ds:uri="http://schemas.microsoft.com/office/2006/metadata/properties"/>
-    <ds:schemaRef ds:uri="http://schemas.microsoft.com/office/infopath/2007/PartnerControls"/>
-  </ds:schemaRefs>
-</ds:datastoreItem>
-</file>
-
-<file path=customXml/itemProps3.xml><?xml version="1.0" encoding="utf-8"?>
-<ds:datastoreItem xmlns:ds="http://schemas.openxmlformats.org/officeDocument/2006/customXml" ds:itemID="{AE688F25-FFA3-4BC9-9A13-31455E2654D4}">
-  <ds:schemaRefs>
-    <ds:schemaRef ds:uri="http://schemas.microsoft.com/sharepoint/v3/contenttype/forms"/>
-  </ds:schemaRefs>
-</ds:datastoreItem>
 </file>
</xml_diff>